<commit_message>
se agrega gitignore, informe preeliminar, y funciones basicas
</commit_message>
<xml_diff>
--- a/Informe preeliminar Desafio_1.docx
+++ b/Informe preeliminar Desafio_1.docx
@@ -4,24 +4,120 @@
   <w:body>
     <w:p>
       <w:pPr>
-        <w:rPr/>
+        <w:jc w:val="center"/>
+        <w:rPr>
+          <w:b w:val="1"/>
+          <w:bCs w:val="1"/>
+          <w:sz w:val="26"/>
+          <w:szCs w:val="26"/>
+        </w:rPr>
       </w:pPr>
       <w:r>
         <w:rPr>
+          <w:b w:val="1"/>
+          <w:bCs w:val="1"/>
+          <w:sz w:val="26"/>
+          <w:szCs w:val="26"/>
           <w:rtl w:val="0"/>
         </w:rPr>
-        <w:t xml:space="preserve">dadadadadá</w:t>
+        <w:t xml:space="preserve">INFORME PREELIMINAR DESAFIO 1</w:t>
       </w:r>
     </w:p>
     <w:p>
       <w:pPr>
+        <w:jc w:val="center"/>
+        <w:rPr>
+          <w:b w:val="1"/>
+          <w:bCs w:val="1"/>
+          <w:sz w:val="26"/>
+          <w:szCs w:val="26"/>
+        </w:rPr>
+      </w:pPr>
+      <w:r>
+        <w:rPr>
+          <w:rtl w:val="0"/>
+        </w:rPr>
+      </w:r>
+    </w:p>
+    <w:p>
+      <w:pPr>
+        <w:jc w:val="left"/>
         <w:rPr/>
       </w:pPr>
       <w:r>
         <w:rPr>
           <w:rtl w:val="0"/>
         </w:rPr>
-        <w:t xml:space="preserve"> vbuc9iaevgdcmk{</w:t>
+        <w:t xml:space="preserve">Para el desafio 1 de informatica 2 se plantea el reto de realizar un juego en c++ inspirado en el juego tetris, esto mediante el uso de punteros, memoria dinamica y la manipulacion de variables a nivel de bits.</w:t>
+        <w:br w:type="textWrapping"/>
+        <w:br w:type="textWrapping"/>
+        <w:t xml:space="preserve">en el analisis se decidió usar un puntero de punteros a char, asi para poder manipular de forma correcta los bits, ademas de el uso de mascaras y operaciones a nivel de bits para lograr los comandos de mover y rotar la figura, tambien se usan para las validaciones y modificaciones del “tablero” al momento de que se complete una linea o que se llegue a un game over.</w:t>
+        <w:br w:type="textWrapping"/>
+        <w:br w:type="textWrapping"/>
+        <w:t xml:space="preserve">A continuación se presenta un diagrama de flujo con la estructura preeliminar que se va a seguir en el programa.</w:t>
+        <w:br w:type="textWrapping"/>
+        <w:br w:type="textWrapping"/>
+      </w:r>
+      <w:r>
+        <w:rPr/>
+        <w:drawing>
+          <wp:inline distB="114300" distT="114300" distL="114300" distR="114300">
+            <wp:extent cx="4976813" cy="4559094"/>
+            <wp:effectExtent b="0" l="0" r="0" t="0"/>
+            <wp:docPr id="1" name="image1.png"/>
+            <a:graphic>
+              <a:graphicData uri="http://schemas.openxmlformats.org/drawingml/2006/picture">
+                <pic:pic>
+                  <pic:nvPicPr>
+                    <pic:cNvPr id="0" name="image1.png"/>
+                    <pic:cNvPicPr preferRelativeResize="0"/>
+                  </pic:nvPicPr>
+                  <pic:blipFill>
+                    <a:blip r:embed="rId6"/>
+                    <a:srcRect b="0" l="0" r="30731" t="13187"/>
+                    <a:stretch>
+                      <a:fillRect/>
+                    </a:stretch>
+                  </pic:blipFill>
+                  <pic:spPr>
+                    <a:xfrm>
+                      <a:off x="0" y="0"/>
+                      <a:ext cx="4976813" cy="4559094"/>
+                    </a:xfrm>
+                    <a:prstGeom prst="rect"/>
+                    <a:ln/>
+                  </pic:spPr>
+                </pic:pic>
+              </a:graphicData>
+            </a:graphic>
+          </wp:inline>
+        </w:drawing>
+      </w:r>
+      <w:r>
+        <w:rPr>
+          <w:rtl w:val="0"/>
+        </w:rPr>
+        <w:br w:type="textWrapping"/>
+        <w:br w:type="textWrapping"/>
+      </w:r>
+      <w:r>
+        <w:rPr>
+          <w:b w:val="1"/>
+          <w:bCs w:val="1"/>
+          <w:rtl w:val="0"/>
+        </w:rPr>
+        <w:t xml:space="preserve">NOTA: </w:t>
+      </w:r>
+      <w:r>
+        <w:rPr>
+          <w:rtl w:val="0"/>
+        </w:rPr>
+        <w:t xml:space="preserve">Lo que aqui se plantea esta sujeto a posibles cambios durante el desarrollo del desafio</w:t>
+      </w:r>
+      <w:r>
+        <w:rPr>
+          <w:rtl w:val="0"/>
+        </w:rPr>
       </w:r>
     </w:p>
     <w:sectPr>

</xml_diff>

<commit_message>
commit corregido con archivos que no se subieron en el anterior
</commit_message>
<xml_diff>
--- a/Informe preeliminar Desafio_1.docx
+++ b/Informe preeliminar Desafio_1.docx
@@ -4,24 +4,120 @@
   <w:body>
     <w:p>
       <w:pPr>
-        <w:rPr/>
+        <w:jc w:val="center"/>
+        <w:rPr>
+          <w:b w:val="1"/>
+          <w:bCs w:val="1"/>
+          <w:sz w:val="26"/>
+          <w:szCs w:val="26"/>
+        </w:rPr>
       </w:pPr>
       <w:r>
         <w:rPr>
+          <w:b w:val="1"/>
+          <w:bCs w:val="1"/>
+          <w:sz w:val="26"/>
+          <w:szCs w:val="26"/>
           <w:rtl w:val="0"/>
         </w:rPr>
-        <w:t xml:space="preserve">dadadadadá</w:t>
+        <w:t xml:space="preserve">INFORME PREELIMINAR DESAFIO 1</w:t>
       </w:r>
     </w:p>
     <w:p>
       <w:pPr>
+        <w:jc w:val="center"/>
+        <w:rPr>
+          <w:b w:val="1"/>
+          <w:bCs w:val="1"/>
+          <w:sz w:val="26"/>
+          <w:szCs w:val="26"/>
+        </w:rPr>
+      </w:pPr>
+      <w:r>
+        <w:rPr>
+          <w:rtl w:val="0"/>
+        </w:rPr>
+      </w:r>
+    </w:p>
+    <w:p>
+      <w:pPr>
+        <w:jc w:val="left"/>
         <w:rPr/>
       </w:pPr>
       <w:r>
         <w:rPr>
           <w:rtl w:val="0"/>
         </w:rPr>
-        <w:t xml:space="preserve"> vbuc9iaevgdcmk{</w:t>
+        <w:t xml:space="preserve">Para el desafio 1 de informatica 2 se plantea el reto de realizar un juego en c++ inspirado en el juego tetris, esto mediante el uso de punteros, memoria dinamica y la manipulacion de variables a nivel de bits.</w:t>
+        <w:br w:type="textWrapping"/>
+        <w:br w:type="textWrapping"/>
+        <w:t xml:space="preserve">en el analisis se decidió usar un puntero de punteros a char, asi para poder manipular de forma correcta los bits, ademas de el uso de mascaras y operaciones a nivel de bits para lograr los comandos de mover y rotar la figura, tambien se usan para las validaciones y modificaciones del “tablero” al momento de que se complete una linea o que se llegue a un game over.</w:t>
+        <w:br w:type="textWrapping"/>
+        <w:br w:type="textWrapping"/>
+        <w:t xml:space="preserve">A continuación se presenta un diagrama de flujo con la estructura preeliminar que se va a seguir en el programa.</w:t>
+        <w:br w:type="textWrapping"/>
+        <w:br w:type="textWrapping"/>
+      </w:r>
+      <w:r>
+        <w:rPr/>
+        <w:drawing>
+          <wp:inline distB="114300" distT="114300" distL="114300" distR="114300">
+            <wp:extent cx="4976813" cy="4559094"/>
+            <wp:effectExtent b="0" l="0" r="0" t="0"/>
+            <wp:docPr id="1" name="image1.png"/>
+            <a:graphic>
+              <a:graphicData uri="http://schemas.openxmlformats.org/drawingml/2006/picture">
+                <pic:pic>
+                  <pic:nvPicPr>
+                    <pic:cNvPr id="0" name="image1.png"/>
+                    <pic:cNvPicPr preferRelativeResize="0"/>
+                  </pic:nvPicPr>
+                  <pic:blipFill>
+                    <a:blip r:embed="rId6"/>
+                    <a:srcRect b="0" l="0" r="30731" t="13187"/>
+                    <a:stretch>
+                      <a:fillRect/>
+                    </a:stretch>
+                  </pic:blipFill>
+                  <pic:spPr>
+                    <a:xfrm>
+                      <a:off x="0" y="0"/>
+                      <a:ext cx="4976813" cy="4559094"/>
+                    </a:xfrm>
+                    <a:prstGeom prst="rect"/>
+                    <a:ln/>
+                  </pic:spPr>
+                </pic:pic>
+              </a:graphicData>
+            </a:graphic>
+          </wp:inline>
+        </w:drawing>
+      </w:r>
+      <w:r>
+        <w:rPr>
+          <w:rtl w:val="0"/>
+        </w:rPr>
+        <w:br w:type="textWrapping"/>
+        <w:br w:type="textWrapping"/>
+      </w:r>
+      <w:r>
+        <w:rPr>
+          <w:b w:val="1"/>
+          <w:bCs w:val="1"/>
+          <w:rtl w:val="0"/>
+        </w:rPr>
+        <w:t xml:space="preserve">NOTA: </w:t>
+      </w:r>
+      <w:r>
+        <w:rPr>
+          <w:rtl w:val="0"/>
+        </w:rPr>
+        <w:t xml:space="preserve">Lo que aqui se plantea esta sujeto a posibles cambios durante el desarrollo del desafio</w:t>
+      </w:r>
+      <w:r>
+        <w:rPr>
+          <w:rtl w:val="0"/>
+        </w:rPr>
       </w:r>
     </w:p>
     <w:sectPr>

</xml_diff>